<commit_message>
refs: verify bibliography, resolve Hale/Reimann/Singh citation stubs (F6)
- Hale et al. 2014 verificado: existe, DOI confirmado
  (10.3389/fpsyt.2014.00081), respalda la afirmacion sobre sistemas
  funcionales implicados en TDAH. Se completa su referencia en el manuscrito.
- Reimann et al. 2024 y Singh et al. 2024: no verificables tras busqueda
  exhaustiva con multiples formulaciones. Se retiran del cuerpo (Methods
  Sec 2.2) y de References, conforme a la regla del plan. Las afirmaciones
  que acompanaban quedan respaldadas por las otras 3-4 citas de cada grupo,
  ya verificadas.
- Auditoria de correspondencia cita<->referencia sobre el documento completo:
  12 referencias finales, sin huerfanas en ningun sentido, sin duplicados,
  sin referencias anadidas para rellenar.
- Ningun valor numerico, tabla o figura modificado. Cambio acotado a un
  parrafo de Methods y tres entradas de References. Respaldo de copia previa
  en docs/finalization/f6_refs/PREVIO_antes_de_F6.docx.
</commit_message>
<xml_diff>
--- a/docs/manuscrito_revisado/Manuscript_Methods_Results_English_Working_v9_9.docx
+++ b/docs/manuscrito_revisado/Manuscript_Methods_Results_English_Working_v9_9.docx
@@ -5968,15 +5968,14 @@
           <w:rFonts w:ascii="Times New Roman" w:hAnsi="Times New Roman"/>
           <w:sz w:val="24"/>
         </w:rPr>
-        <w:t xml:space="preserve">The reduced panels include regions assigned to five functional systems implicated in ADHD: the default mode network (DMN), executive control network (ECN), salience network (SN), dorsal attention network (DAN), and frontostriatal-thalamic circuit (FST) (Damiani et al., 2021; Francx et al., 2015; Hale et al., 2014; Singh et al., 2024). These systems support self-referential, executive, salience, attentional, and motor processes relevant to ADHD </w:t>
-      </w:r>
-      <w:r>
-        <w:rPr>
-          <w:rFonts w:ascii="Times New Roman" w:hAnsi="Times New Roman"/>
-          <w:sz w:val="24"/>
-        </w:rPr>
-        <w:lastRenderedPageBreak/>
-        <w:t xml:space="preserve">(Blomberg et al., 2022; Koirala et al., 2024; Parlatini et al., 2023; Reimann et al., 2024; Sutcubasi et al., 2020). Network assignments were used to organize the fixed ROI panels and were </w:t>
+        <w:t xml:space="preserve">The reduced panels include regions assigned to five functional systems implicated in ADHD: the default mode network (DMN), executive control network (ECN), salience network (SN), dorsal attention network (DAN), and frontostriatal-thalamic circuit (FST) (Damiani et al., 2021; Francx et al., 2015; Hale et al., 2014). These systems support self-referential, executive, salience, attentional, and motor processes relevant to ADHD </w:t>
+      </w:r>
+      <w:r>
+        <w:rPr>
+          <w:rFonts w:ascii="Times New Roman" w:hAnsi="Times New Roman"/>
+          <w:sz w:val="24"/>
+        </w:rPr>
+        <w:t xml:space="preserve">(Blomberg et al., 2022; Koirala et al., 2024; Parlatini et al., 2023; Sutcubasi et al., 2020). Network assignments were used to organize the fixed ROI panels and were </w:t>
       </w:r>
       <w:proofErr w:type="spellStart"/>
       <w:r>
@@ -23454,7 +23453,7 @@
           <w:szCs w:val="24"/>
           <w:lang w:val="en-US"/>
         </w:rPr>
-        <w:t>Hale, T. S., et al. (2014). [Reference pending bibliographic verification against an authoritative source -- not resolved as of this revision; see delivery report, Sec. 11.]</w:t>
+        <w:t>Hale, T. S., Kane, A. M., Kaminsky, O., Tung, K. L., Wiley, J. F., McGough, J. J., Loo, S. K., &amp; Kaplan, J. T. (2014). Visual network asymmetry and default mode network function in ADHD: An fMRI study. Frontiers in Psychiatry, 5, Article 81. https://doi.org/10.3389/fpsyt.2014.00081</w:t>
       </w:r>
     </w:p>
     <w:p>
@@ -23522,50 +23521,6 @@
         </w:rPr>
         <w:lastRenderedPageBreak/>
         <w:t>Parlatini, V., Itahashi, T., Lee, Y., Liu, S., Nguyen, T. T., Aoki, Y. Y., et al. (2023). White matter alterations in attention-deficit/hyperactivity disorder (ADHD): a systematic review of 129 diffusion imaging studies with meta-analysis. Molecular Psychiatry, 28, 4098–4123. https://doi.org/10.1038/s41380-023-02173-1</w:t>
-      </w:r>
-    </w:p>
-    <w:p>
-      <w:pPr>
-        <w:spacing w:after="0" w:line="360" w:lineRule="auto"/>
-        <w:ind w:left="720" w:hanging="720"/>
-        <w:jc w:val="both"/>
-        <w:rPr>
-          <w:rFonts w:ascii="Times New Roman" w:hAnsi="Times New Roman" w:cs="Times New Roman"/>
-          <w:sz w:val="24"/>
-          <w:szCs w:val="24"/>
-          <w:lang w:val="en-US"/>
-        </w:rPr>
-      </w:pPr>
-      <w:r>
-        <w:rPr>
-          <w:rFonts w:ascii="Times New Roman" w:hAnsi="Times New Roman" w:cs="Times New Roman"/>
-          <w:sz w:val="24"/>
-          <w:szCs w:val="24"/>
-          <w:lang w:val="en-US"/>
-        </w:rPr>
-        <w:t>Reimann, G. M., et al. (2024). [Reference pending bibliographic verification against an authoritative source -- not resolved as of this revision; see delivery report, Sec. 11.]</w:t>
-      </w:r>
-    </w:p>
-    <w:p>
-      <w:pPr>
-        <w:spacing w:after="0" w:line="360" w:lineRule="auto"/>
-        <w:ind w:left="720" w:hanging="720"/>
-        <w:jc w:val="both"/>
-        <w:rPr>
-          <w:rFonts w:ascii="Times New Roman" w:hAnsi="Times New Roman" w:cs="Times New Roman"/>
-          <w:sz w:val="24"/>
-          <w:szCs w:val="24"/>
-          <w:lang w:val="en-US"/>
-        </w:rPr>
-      </w:pPr>
-      <w:r>
-        <w:rPr>
-          <w:rFonts w:ascii="Times New Roman" w:hAnsi="Times New Roman" w:cs="Times New Roman"/>
-          <w:sz w:val="24"/>
-          <w:szCs w:val="24"/>
-          <w:lang w:val="en-US"/>
-        </w:rPr>
-        <w:t>Singh, et al. (2024). [Reference pending bibliographic verification against an authoritative source -- not resolved as of this revision; see delivery report, Sec. 11.]</w:t>
       </w:r>
     </w:p>
     <w:p>

</xml_diff>